<commit_message>
Add live Streamlit URL (https://bjvsaaxxmyxmvb9zxbhcpn.streamlit.app/) to README and report
</commit_message>
<xml_diff>
--- a/Combustion_Kinetics_ML_Report.docx
+++ b/Combustion_Kinetics_ML_Report.docx
@@ -3658,27 +3658,7 @@
         <w:jc w:val="both"/>
       </w:pPr>
       <w:r>
-        <w:rPr>
-          <w:sz w:val="22"/>
-          <w:szCs w:val="22"/>
-        </w:rPr>
-        <w:t xml:space="preserve">To make the trained models directly usable without requiring users to retrain them, all five models (and the associated preprocessing pipelines) were serialised and packaged into an interactive </w:t>
-      </w:r>
-      <w:proofErr w:type="spellStart"/>
-      <w:r>
-        <w:rPr>
-          <w:sz w:val="22"/>
-          <w:szCs w:val="22"/>
-        </w:rPr>
-        <w:t>Streamlit</w:t>
-      </w:r>
-      <w:proofErr w:type="spellEnd"/>
-      <w:r>
-        <w:rPr>
-          <w:sz w:val="22"/>
-          <w:szCs w:val="22"/>
-        </w:rPr>
-        <w:t xml:space="preserve"> web application (app.py). The application allows a user to:</w:t>
+        <w:t>To make the trained models directly usable without requiring users to retrain them, all five models (and the associated preprocessing pipelines) were serialised and packaged into an interactive Streamlit web application (app.py), which is deployed live and accessible at https://bjvsaaxxmyxmvb9zxbhcpn.streamlit.app/. The application allows a user to:</w:t>
       </w:r>
     </w:p>
     <w:p>

</xml_diff>